<commit_message>
i have done up to 7 without saving sorry
</commit_message>
<xml_diff>
--- a/guide.docx
+++ b/guide.docx
@@ -12,17 +12,58 @@
         <w:rPr>
           <w:lang w:val="en-IE"/>
         </w:rPr>
-        <w:t>1.</w:t>
-      </w:r>
-    </w:p>
-    <w:p>
-      <w:pPr>
-        <w:rPr>
-          <w:lang w:val="en-IE"/>
-        </w:rPr>
-      </w:pPr>
-      <w:r>
-        <w:rPr>
+        <w:t>Git Guide (Alex Murphy)</w:t>
+      </w:r>
+    </w:p>
+    <w:p>
+      <w:pPr>
+        <w:rPr>
+          <w:lang w:val="en-IE"/>
+        </w:rPr>
+      </w:pPr>
+    </w:p>
+    <w:p>
+      <w:pPr>
+        <w:rPr>
+          <w:lang w:val="en-IE"/>
+        </w:rPr>
+      </w:pPr>
+      <w:r>
+        <w:rPr>
+          <w:lang w:val="en-IE"/>
+        </w:rPr>
+        <w:t>1. Init</w:t>
+      </w:r>
+    </w:p>
+    <w:p>
+      <w:pPr>
+        <w:rPr>
+          <w:lang w:val="en-IE"/>
+        </w:rPr>
+      </w:pPr>
+      <w:r>
+        <w:rPr>
+          <w:lang w:val="en-IE"/>
+        </w:rPr>
+        <w:t>‘git init’ is used to create a new empty git repository. An initial branch without any commits will be created. Running the command in an existing repository will not overwrite things that are already there.</w:t>
+      </w:r>
+    </w:p>
+    <w:p>
+      <w:pPr>
+        <w:rPr>
+          <w:lang w:val="en-IE"/>
+        </w:rPr>
+      </w:pPr>
+    </w:p>
+    <w:p>
+      <w:pPr>
+        <w:rPr>
+          <w:lang w:val="en-IE"/>
+        </w:rPr>
+      </w:pPr>
+      <w:r>
+        <w:rPr>
+          <w:noProof/>
           <w:lang w:val="en-IE"/>
         </w:rPr>
         <w:drawing>
@@ -68,21 +109,63 @@
           <w:lang w:val="en-IE"/>
         </w:rPr>
       </w:pPr>
-      <w:r>
-        <w:rPr>
-          <w:lang w:val="en-IE"/>
-        </w:rPr>
-        <w:t>2.</w:t>
-      </w:r>
-    </w:p>
-    <w:p>
-      <w:pPr>
-        <w:rPr>
-          <w:lang w:val="en-IE"/>
-        </w:rPr>
-      </w:pPr>
-      <w:r>
-        <w:rPr>
+    </w:p>
+    <w:p>
+      <w:pPr>
+        <w:rPr>
+          <w:lang w:val="en-IE"/>
+        </w:rPr>
+      </w:pPr>
+      <w:r>
+        <w:rPr>
+          <w:lang w:val="en-IE"/>
+        </w:rPr>
+        <w:t>2. Add</w:t>
+      </w:r>
+    </w:p>
+    <w:p>
+      <w:pPr>
+        <w:rPr>
+          <w:lang w:val="en-IE"/>
+        </w:rPr>
+      </w:pPr>
+      <w:r>
+        <w:rPr>
+          <w:lang w:val="en-IE"/>
+        </w:rPr>
+        <w:t>‘</w:t>
+      </w:r>
+      <w:proofErr w:type="gramStart"/>
+      <w:r>
+        <w:rPr>
+          <w:lang w:val="en-IE"/>
+        </w:rPr>
+        <w:t>git</w:t>
+      </w:r>
+      <w:proofErr w:type="gramEnd"/>
+      <w:r>
+        <w:rPr>
+          <w:lang w:val="en-IE"/>
+        </w:rPr>
+        <w:t xml:space="preserve"> add’ adds contents or new or changed files to the index (what you use to prepare the contents of the next commit). When ‘git commit’ is ran without any other arguments, it will only commit staged changes.</w:t>
+      </w:r>
+    </w:p>
+    <w:p>
+      <w:pPr>
+        <w:rPr>
+          <w:lang w:val="en-IE"/>
+        </w:rPr>
+      </w:pPr>
+    </w:p>
+    <w:p>
+      <w:pPr>
+        <w:rPr>
+          <w:lang w:val="en-IE"/>
+        </w:rPr>
+      </w:pPr>
+      <w:r>
+        <w:rPr>
+          <w:noProof/>
           <w:lang w:val="en-IE"/>
         </w:rPr>
         <w:drawing>
@@ -128,6 +211,627 @@
           <w:lang w:val="en-IE"/>
         </w:rPr>
       </w:pPr>
+    </w:p>
+    <w:p>
+      <w:pPr>
+        <w:rPr>
+          <w:lang w:val="en-IE"/>
+        </w:rPr>
+      </w:pPr>
+      <w:r>
+        <w:rPr>
+          <w:lang w:val="en-IE"/>
+        </w:rPr>
+        <w:t>3. Status</w:t>
+      </w:r>
+    </w:p>
+    <w:p>
+      <w:pPr>
+        <w:rPr>
+          <w:lang w:val="en-IE"/>
+        </w:rPr>
+      </w:pPr>
+      <w:r>
+        <w:rPr>
+          <w:lang w:val="en-IE"/>
+        </w:rPr>
+        <w:t>‘</w:t>
+      </w:r>
+      <w:proofErr w:type="gramStart"/>
+      <w:r>
+        <w:rPr>
+          <w:lang w:val="en-IE"/>
+        </w:rPr>
+        <w:t>git</w:t>
+      </w:r>
+      <w:proofErr w:type="gramEnd"/>
+      <w:r>
+        <w:rPr>
+          <w:lang w:val="en-IE"/>
+        </w:rPr>
+        <w:t xml:space="preserve"> status’ shows the working tree status. It displays paths that have differences between the index file and the HEAD commit, paths that have differences between the working tree and the index, and paths in the working tree that aren’t tracked by Git</w:t>
+      </w:r>
+    </w:p>
+    <w:p>
+      <w:pPr>
+        <w:rPr>
+          <w:lang w:val="en-IE"/>
+        </w:rPr>
+      </w:pPr>
+    </w:p>
+    <w:p>
+      <w:pPr>
+        <w:rPr>
+          <w:lang w:val="en-IE"/>
+        </w:rPr>
+      </w:pPr>
+      <w:r>
+        <w:rPr>
+          <w:lang w:val="en-IE"/>
+        </w:rPr>
+        <w:drawing>
+          <wp:inline distT="0" distB="0" distL="0" distR="0" wp14:anchorId="12185436" wp14:editId="4A636798">
+            <wp:extent cx="5191850" cy="1390844"/>
+            <wp:effectExtent l="0" t="0" r="8890" b="0"/>
+            <wp:docPr id="3" name="Picture 3"/>
+            <wp:cNvGraphicFramePr>
+              <a:graphicFrameLocks xmlns:a="http://schemas.openxmlformats.org/drawingml/2006/main" noChangeAspect="1"/>
+            </wp:cNvGraphicFramePr>
+            <a:graphic xmlns:a="http://schemas.openxmlformats.org/drawingml/2006/main">
+              <a:graphicData uri="http://schemas.openxmlformats.org/drawingml/2006/picture">
+                <pic:pic xmlns:pic="http://schemas.openxmlformats.org/drawingml/2006/picture">
+                  <pic:nvPicPr>
+                    <pic:cNvPr id="1" name=""/>
+                    <pic:cNvPicPr/>
+                  </pic:nvPicPr>
+                  <pic:blipFill>
+                    <a:blip r:embed="rId9"/>
+                    <a:stretch>
+                      <a:fillRect/>
+                    </a:stretch>
+                  </pic:blipFill>
+                  <pic:spPr>
+                    <a:xfrm>
+                      <a:off x="0" y="0"/>
+                      <a:ext cx="5191850" cy="1390844"/>
+                    </a:xfrm>
+                    <a:prstGeom prst="rect">
+                      <a:avLst/>
+                    </a:prstGeom>
+                  </pic:spPr>
+                </pic:pic>
+              </a:graphicData>
+            </a:graphic>
+          </wp:inline>
+        </w:drawing>
+      </w:r>
+    </w:p>
+    <w:p>
+      <w:pPr>
+        <w:rPr>
+          <w:lang w:val="en-IE"/>
+        </w:rPr>
+      </w:pPr>
+    </w:p>
+    <w:p>
+      <w:pPr>
+        <w:rPr>
+          <w:lang w:val="en-IE"/>
+        </w:rPr>
+      </w:pPr>
+    </w:p>
+    <w:p>
+      <w:pPr>
+        <w:rPr>
+          <w:lang w:val="en-IE"/>
+        </w:rPr>
+      </w:pPr>
+      <w:r>
+        <w:rPr>
+          <w:lang w:val="en-IE"/>
+        </w:rPr>
+        <w:lastRenderedPageBreak/>
+        <w:t>4. Commit</w:t>
+      </w:r>
+    </w:p>
+    <w:p>
+      <w:pPr>
+        <w:rPr>
+          <w:lang w:val="en-IE"/>
+        </w:rPr>
+      </w:pPr>
+      <w:r>
+        <w:rPr>
+          <w:lang w:val="en-IE"/>
+        </w:rPr>
+        <w:t>‘</w:t>
+      </w:r>
+      <w:proofErr w:type="gramStart"/>
+      <w:r>
+        <w:rPr>
+          <w:lang w:val="en-IE"/>
+        </w:rPr>
+        <w:t>git</w:t>
+      </w:r>
+      <w:proofErr w:type="gramEnd"/>
+      <w:r>
+        <w:rPr>
+          <w:lang w:val="en-IE"/>
+        </w:rPr>
+        <w:t xml:space="preserve"> commit’ records changes to the selected repository. It c</w:t>
+      </w:r>
+      <w:r>
+        <w:rPr>
+          <w:lang w:val="en-IE"/>
+        </w:rPr>
+        <w:t>reate</w:t>
+      </w:r>
+      <w:r>
+        <w:rPr>
+          <w:lang w:val="en-IE"/>
+        </w:rPr>
+        <w:t>s</w:t>
+      </w:r>
+      <w:r>
+        <w:rPr>
+          <w:lang w:val="en-IE"/>
+        </w:rPr>
+        <w:t xml:space="preserve"> a new commit containing the current contents of the index and the given log message describing the changes</w:t>
+      </w:r>
+    </w:p>
+    <w:p>
+      <w:pPr>
+        <w:rPr>
+          <w:lang w:val="en-IE"/>
+        </w:rPr>
+      </w:pPr>
+    </w:p>
+    <w:p>
+      <w:pPr>
+        <w:rPr>
+          <w:lang w:val="en-IE"/>
+        </w:rPr>
+      </w:pPr>
+      <w:r>
+        <w:rPr>
+          <w:lang w:val="en-IE"/>
+        </w:rPr>
+        <w:drawing>
+          <wp:inline distT="0" distB="0" distL="0" distR="0" wp14:anchorId="2407A191" wp14:editId="53CE02FA">
+            <wp:extent cx="5201376" cy="1371791"/>
+            <wp:effectExtent l="0" t="0" r="0" b="0"/>
+            <wp:docPr id="4" name="Picture 4"/>
+            <wp:cNvGraphicFramePr>
+              <a:graphicFrameLocks xmlns:a="http://schemas.openxmlformats.org/drawingml/2006/main" noChangeAspect="1"/>
+            </wp:cNvGraphicFramePr>
+            <a:graphic xmlns:a="http://schemas.openxmlformats.org/drawingml/2006/main">
+              <a:graphicData uri="http://schemas.openxmlformats.org/drawingml/2006/picture">
+                <pic:pic xmlns:pic="http://schemas.openxmlformats.org/drawingml/2006/picture">
+                  <pic:nvPicPr>
+                    <pic:cNvPr id="1" name=""/>
+                    <pic:cNvPicPr/>
+                  </pic:nvPicPr>
+                  <pic:blipFill>
+                    <a:blip r:embed="rId10"/>
+                    <a:stretch>
+                      <a:fillRect/>
+                    </a:stretch>
+                  </pic:blipFill>
+                  <pic:spPr>
+                    <a:xfrm>
+                      <a:off x="0" y="0"/>
+                      <a:ext cx="5201376" cy="1371791"/>
+                    </a:xfrm>
+                    <a:prstGeom prst="rect">
+                      <a:avLst/>
+                    </a:prstGeom>
+                  </pic:spPr>
+                </pic:pic>
+              </a:graphicData>
+            </a:graphic>
+          </wp:inline>
+        </w:drawing>
+      </w:r>
+    </w:p>
+    <w:p>
+      <w:pPr>
+        <w:rPr>
+          <w:lang w:val="en-IE"/>
+        </w:rPr>
+      </w:pPr>
+    </w:p>
+    <w:p>
+      <w:pPr>
+        <w:rPr>
+          <w:lang w:val="en-IE"/>
+        </w:rPr>
+      </w:pPr>
+      <w:r>
+        <w:rPr>
+          <w:lang w:val="en-IE"/>
+        </w:rPr>
+        <w:t xml:space="preserve">5. Remote </w:t>
+      </w:r>
+    </w:p>
+    <w:p>
+      <w:pPr>
+        <w:rPr>
+          <w:lang w:val="en-IE"/>
+        </w:rPr>
+      </w:pPr>
+      <w:r>
+        <w:rPr>
+          <w:lang w:val="en-IE"/>
+        </w:rPr>
+        <w:t>‘</w:t>
+      </w:r>
+      <w:proofErr w:type="gramStart"/>
+      <w:r>
+        <w:rPr>
+          <w:lang w:val="en-IE"/>
+        </w:rPr>
+        <w:t>git</w:t>
+      </w:r>
+      <w:proofErr w:type="gramEnd"/>
+      <w:r>
+        <w:rPr>
+          <w:lang w:val="en-IE"/>
+        </w:rPr>
+        <w:t xml:space="preserve"> remote’ manages the set of repositories whose branches you track</w:t>
+      </w:r>
+    </w:p>
+    <w:p>
+      <w:pPr>
+        <w:rPr>
+          <w:lang w:val="en-IE"/>
+        </w:rPr>
+      </w:pPr>
+    </w:p>
+    <w:p>
+      <w:pPr>
+        <w:rPr>
+          <w:lang w:val="en-IE"/>
+        </w:rPr>
+      </w:pPr>
+      <w:r>
+        <w:rPr>
+          <w:lang w:val="en-IE"/>
+        </w:rPr>
+        <w:drawing>
+          <wp:inline distT="0" distB="0" distL="0" distR="0" wp14:anchorId="42810E12" wp14:editId="6C0593C4">
+            <wp:extent cx="3353268" cy="409632"/>
+            <wp:effectExtent l="0" t="0" r="0" b="9525"/>
+            <wp:docPr id="5" name="Picture 5"/>
+            <wp:cNvGraphicFramePr>
+              <a:graphicFrameLocks xmlns:a="http://schemas.openxmlformats.org/drawingml/2006/main" noChangeAspect="1"/>
+            </wp:cNvGraphicFramePr>
+            <a:graphic xmlns:a="http://schemas.openxmlformats.org/drawingml/2006/main">
+              <a:graphicData uri="http://schemas.openxmlformats.org/drawingml/2006/picture">
+                <pic:pic xmlns:pic="http://schemas.openxmlformats.org/drawingml/2006/picture">
+                  <pic:nvPicPr>
+                    <pic:cNvPr id="1" name=""/>
+                    <pic:cNvPicPr/>
+                  </pic:nvPicPr>
+                  <pic:blipFill>
+                    <a:blip r:embed="rId11"/>
+                    <a:stretch>
+                      <a:fillRect/>
+                    </a:stretch>
+                  </pic:blipFill>
+                  <pic:spPr>
+                    <a:xfrm>
+                      <a:off x="0" y="0"/>
+                      <a:ext cx="3353268" cy="409632"/>
+                    </a:xfrm>
+                    <a:prstGeom prst="rect">
+                      <a:avLst/>
+                    </a:prstGeom>
+                  </pic:spPr>
+                </pic:pic>
+              </a:graphicData>
+            </a:graphic>
+          </wp:inline>
+        </w:drawing>
+      </w:r>
+    </w:p>
+    <w:p>
+      <w:pPr>
+        <w:rPr>
+          <w:lang w:val="en-IE"/>
+        </w:rPr>
+      </w:pPr>
+    </w:p>
+    <w:p>
+      <w:pPr>
+        <w:rPr>
+          <w:lang w:val="en-IE"/>
+        </w:rPr>
+      </w:pPr>
+      <w:r>
+        <w:rPr>
+          <w:lang w:val="en-IE"/>
+        </w:rPr>
+        <w:t>6. Branch</w:t>
+      </w:r>
+    </w:p>
+    <w:p>
+      <w:pPr>
+        <w:rPr>
+          <w:lang w:val="en-IE"/>
+        </w:rPr>
+      </w:pPr>
+      <w:r>
+        <w:rPr>
+          <w:lang w:val="en-IE"/>
+        </w:rPr>
+        <w:t>‘</w:t>
+      </w:r>
+      <w:proofErr w:type="gramStart"/>
+      <w:r>
+        <w:rPr>
+          <w:lang w:val="en-IE"/>
+        </w:rPr>
+        <w:t>git</w:t>
+      </w:r>
+      <w:proofErr w:type="gramEnd"/>
+      <w:r>
+        <w:rPr>
+          <w:lang w:val="en-IE"/>
+        </w:rPr>
+        <w:t xml:space="preserve"> branch’ is used to list, create or delete</w:t>
+      </w:r>
+      <w:r>
+        <w:rPr>
+          <w:lang w:val="en-IE"/>
+        </w:rPr>
+        <w:t xml:space="preserve"> branches</w:t>
+      </w:r>
+    </w:p>
+    <w:p>
+      <w:pPr>
+        <w:rPr>
+          <w:lang w:val="en-IE"/>
+        </w:rPr>
+      </w:pPr>
+    </w:p>
+    <w:p>
+      <w:pPr>
+        <w:rPr>
+          <w:lang w:val="en-IE"/>
+        </w:rPr>
+      </w:pPr>
+      <w:r>
+        <w:rPr>
+          <w:lang w:val="en-IE"/>
+        </w:rPr>
+        <w:drawing>
+          <wp:inline distT="0" distB="0" distL="0" distR="0" wp14:anchorId="19DEA187" wp14:editId="0CE77ACF">
+            <wp:extent cx="3324689" cy="409632"/>
+            <wp:effectExtent l="0" t="0" r="9525" b="9525"/>
+            <wp:docPr id="6" name="Picture 6"/>
+            <wp:cNvGraphicFramePr>
+              <a:graphicFrameLocks xmlns:a="http://schemas.openxmlformats.org/drawingml/2006/main" noChangeAspect="1"/>
+            </wp:cNvGraphicFramePr>
+            <a:graphic xmlns:a="http://schemas.openxmlformats.org/drawingml/2006/main">
+              <a:graphicData uri="http://schemas.openxmlformats.org/drawingml/2006/picture">
+                <pic:pic xmlns:pic="http://schemas.openxmlformats.org/drawingml/2006/picture">
+                  <pic:nvPicPr>
+                    <pic:cNvPr id="1" name=""/>
+                    <pic:cNvPicPr/>
+                  </pic:nvPicPr>
+                  <pic:blipFill>
+                    <a:blip r:embed="rId12"/>
+                    <a:stretch>
+                      <a:fillRect/>
+                    </a:stretch>
+                  </pic:blipFill>
+                  <pic:spPr>
+                    <a:xfrm>
+                      <a:off x="0" y="0"/>
+                      <a:ext cx="3324689" cy="409632"/>
+                    </a:xfrm>
+                    <a:prstGeom prst="rect">
+                      <a:avLst/>
+                    </a:prstGeom>
+                  </pic:spPr>
+                </pic:pic>
+              </a:graphicData>
+            </a:graphic>
+          </wp:inline>
+        </w:drawing>
+      </w:r>
+    </w:p>
+    <w:p>
+      <w:pPr>
+        <w:rPr>
+          <w:lang w:val="en-IE"/>
+        </w:rPr>
+      </w:pPr>
+    </w:p>
+    <w:p>
+      <w:pPr>
+        <w:rPr>
+          <w:lang w:val="en-IE"/>
+        </w:rPr>
+      </w:pPr>
+      <w:r>
+        <w:rPr>
+          <w:lang w:val="en-IE"/>
+        </w:rPr>
+        <w:t>7. Checkout</w:t>
+      </w:r>
+    </w:p>
+    <w:p>
+      <w:pPr>
+        <w:rPr>
+          <w:lang w:val="en-IE"/>
+        </w:rPr>
+      </w:pPr>
+      <w:r>
+        <w:rPr>
+          <w:lang w:val="en-IE"/>
+        </w:rPr>
+        <w:t>‘</w:t>
+      </w:r>
+      <w:proofErr w:type="gramStart"/>
+      <w:r>
+        <w:rPr>
+          <w:lang w:val="en-IE"/>
+        </w:rPr>
+        <w:t>git</w:t>
+      </w:r>
+      <w:proofErr w:type="gramEnd"/>
+      <w:r>
+        <w:rPr>
+          <w:lang w:val="en-IE"/>
+        </w:rPr>
+        <w:t xml:space="preserve"> checkout’ s</w:t>
+      </w:r>
+      <w:r>
+        <w:rPr>
+          <w:lang w:val="en-IE"/>
+        </w:rPr>
+        <w:t>witch</w:t>
+      </w:r>
+      <w:r>
+        <w:rPr>
+          <w:lang w:val="en-IE"/>
+        </w:rPr>
+        <w:t>es</w:t>
+      </w:r>
+      <w:r>
+        <w:rPr>
+          <w:lang w:val="en-IE"/>
+        </w:rPr>
+        <w:t xml:space="preserve"> branches or restore</w:t>
+      </w:r>
+      <w:r>
+        <w:rPr>
+          <w:lang w:val="en-IE"/>
+        </w:rPr>
+        <w:t>s</w:t>
+      </w:r>
+      <w:r>
+        <w:rPr>
+          <w:lang w:val="en-IE"/>
+        </w:rPr>
+        <w:t xml:space="preserve"> working tree files</w:t>
+      </w:r>
+    </w:p>
+    <w:p>
+      <w:pPr>
+        <w:rPr>
+          <w:lang w:val="en-IE"/>
+        </w:rPr>
+      </w:pPr>
+    </w:p>
+    <w:p>
+      <w:pPr>
+        <w:rPr>
+          <w:lang w:val="en-IE"/>
+        </w:rPr>
+      </w:pPr>
+      <w:r>
+        <w:rPr>
+          <w:lang w:val="en-IE"/>
+        </w:rPr>
+        <w:drawing>
+          <wp:inline distT="0" distB="0" distL="0" distR="0" wp14:anchorId="71352814" wp14:editId="1F4F72A4">
+            <wp:extent cx="3334215" cy="457264"/>
+            <wp:effectExtent l="0" t="0" r="0" b="0"/>
+            <wp:docPr id="7" name="Picture 7"/>
+            <wp:cNvGraphicFramePr>
+              <a:graphicFrameLocks xmlns:a="http://schemas.openxmlformats.org/drawingml/2006/main" noChangeAspect="1"/>
+            </wp:cNvGraphicFramePr>
+            <a:graphic xmlns:a="http://schemas.openxmlformats.org/drawingml/2006/main">
+              <a:graphicData uri="http://schemas.openxmlformats.org/drawingml/2006/picture">
+                <pic:pic xmlns:pic="http://schemas.openxmlformats.org/drawingml/2006/picture">
+                  <pic:nvPicPr>
+                    <pic:cNvPr id="1" name=""/>
+                    <pic:cNvPicPr/>
+                  </pic:nvPicPr>
+                  <pic:blipFill>
+                    <a:blip r:embed="rId13"/>
+                    <a:stretch>
+                      <a:fillRect/>
+                    </a:stretch>
+                  </pic:blipFill>
+                  <pic:spPr>
+                    <a:xfrm>
+                      <a:off x="0" y="0"/>
+                      <a:ext cx="3334215" cy="457264"/>
+                    </a:xfrm>
+                    <a:prstGeom prst="rect">
+                      <a:avLst/>
+                    </a:prstGeom>
+                  </pic:spPr>
+                </pic:pic>
+              </a:graphicData>
+            </a:graphic>
+          </wp:inline>
+        </w:drawing>
+      </w:r>
+    </w:p>
+    <w:p>
+      <w:pPr>
+        <w:rPr>
+          <w:lang w:val="en-IE"/>
+        </w:rPr>
+      </w:pPr>
+    </w:p>
+    <w:p>
+      <w:pPr>
+        <w:rPr>
+          <w:lang w:val="en-IE"/>
+        </w:rPr>
+      </w:pPr>
+      <w:r>
+        <w:rPr>
+          <w:lang w:val="en-IE"/>
+        </w:rPr>
+        <w:lastRenderedPageBreak/>
+        <w:t>8. Merge</w:t>
+      </w:r>
+    </w:p>
+    <w:p>
+      <w:pPr>
+        <w:rPr>
+          <w:lang w:val="en-IE"/>
+        </w:rPr>
+      </w:pPr>
+    </w:p>
+    <w:p>
+      <w:pPr>
+        <w:rPr>
+          <w:lang w:val="en-IE"/>
+        </w:rPr>
+      </w:pPr>
+      <w:r>
+        <w:rPr>
+          <w:lang w:val="en-IE"/>
+        </w:rPr>
+        <w:t>9. Log</w:t>
+      </w:r>
+    </w:p>
+    <w:p>
+      <w:pPr>
+        <w:rPr>
+          <w:lang w:val="en-IE"/>
+        </w:rPr>
+      </w:pPr>
+    </w:p>
+    <w:p>
+      <w:pPr>
+        <w:rPr>
+          <w:lang w:val="en-IE"/>
+        </w:rPr>
+      </w:pPr>
+      <w:r>
+        <w:rPr>
+          <w:lang w:val="en-IE"/>
+        </w:rPr>
+        <w:t>10. Push</w:t>
+      </w:r>
     </w:p>
     <w:sectPr>
       <w:pgSz w:w="11906" w:h="16838"/>
@@ -1355,6 +2059,23 @@
 </file>
 
 <file path=customXml/item1.xml><?xml version="1.0" encoding="utf-8"?>
+<p:properties xmlns:p="http://schemas.microsoft.com/office/2006/metadata/properties" xmlns:xsi="http://www.w3.org/2001/XMLSchema-instance" xmlns:pc="http://schemas.microsoft.com/office/infopath/2007/PartnerControls">
+  <documentManagement>
+    <_activity xmlns="9429147d-c046-4c6c-ad5d-4c11c57a8b60" xsi:nil="true"/>
+  </documentManagement>
+</p:properties>
+</file>
+
+<file path=customXml/item2.xml><?xml version="1.0" encoding="utf-8"?>
+<?mso-contentType ?>
+<FormTemplates xmlns="http://schemas.microsoft.com/sharepoint/v3/contenttype/forms">
+  <Display>DocumentLibraryForm</Display>
+  <Edit>DocumentLibraryForm</Edit>
+  <New>DocumentLibraryForm</New>
+</FormTemplates>
+</file>
+
+<file path=customXml/item3.xml><?xml version="1.0" encoding="utf-8"?>
 <ct:contentTypeSchema xmlns:ct="http://schemas.microsoft.com/office/2006/metadata/contentType" xmlns:ma="http://schemas.microsoft.com/office/2006/metadata/properties/metaAttributes" ct:_="" ma:_="" ma:contentTypeName="Document" ma:contentTypeID="0x0101006633C14E5EE1684AAC2982F4EC09954E" ma:contentTypeVersion="9" ma:contentTypeDescription="Create a new document." ma:contentTypeScope="" ma:versionID="7b4d07ff1877f2700fa83ff5f370da06">
   <xsd:schema xmlns:xsd="http://www.w3.org/2001/XMLSchema" xmlns:xs="http://www.w3.org/2001/XMLSchema" xmlns:p="http://schemas.microsoft.com/office/2006/metadata/properties" xmlns:ns3="9429147d-c046-4c6c-ad5d-4c11c57a8b60" targetNamespace="http://schemas.microsoft.com/office/2006/metadata/properties" ma:root="true" ma:fieldsID="f52aebaf36e40baf1ab77afe35bda30c" ns3:_="">
     <xsd:import namespace="9429147d-c046-4c6c-ad5d-4c11c57a8b60"/>
@@ -1530,24 +2251,25 @@
 </ct:contentTypeSchema>
 </file>
 
-<file path=customXml/item2.xml><?xml version="1.0" encoding="utf-8"?>
-<?mso-contentType ?>
-<FormTemplates xmlns="http://schemas.microsoft.com/sharepoint/v3/contenttype/forms">
-  <Display>DocumentLibraryForm</Display>
-  <Edit>DocumentLibraryForm</Edit>
-  <New>DocumentLibraryForm</New>
-</FormTemplates>
+<file path=customXml/itemProps1.xml><?xml version="1.0" encoding="utf-8"?>
+<ds:datastoreItem xmlns:ds="http://schemas.openxmlformats.org/officeDocument/2006/customXml" ds:itemID="{4E66CF83-F9E2-4336-800B-4E9E479183B3}">
+  <ds:schemaRefs>
+    <ds:schemaRef ds:uri="http://schemas.microsoft.com/office/2006/metadata/properties"/>
+    <ds:schemaRef ds:uri="http://schemas.microsoft.com/office/infopath/2007/PartnerControls"/>
+    <ds:schemaRef ds:uri="9429147d-c046-4c6c-ad5d-4c11c57a8b60"/>
+  </ds:schemaRefs>
+</ds:datastoreItem>
 </file>
 
-<file path=customXml/item3.xml><?xml version="1.0" encoding="utf-8"?>
-<p:properties xmlns:p="http://schemas.microsoft.com/office/2006/metadata/properties" xmlns:xsi="http://www.w3.org/2001/XMLSchema-instance" xmlns:pc="http://schemas.microsoft.com/office/infopath/2007/PartnerControls">
-  <documentManagement>
-    <_activity xmlns="9429147d-c046-4c6c-ad5d-4c11c57a8b60" xsi:nil="true"/>
-  </documentManagement>
-</p:properties>
+<file path=customXml/itemProps2.xml><?xml version="1.0" encoding="utf-8"?>
+<ds:datastoreItem xmlns:ds="http://schemas.openxmlformats.org/officeDocument/2006/customXml" ds:itemID="{CA523F33-C24B-4143-8B7F-915CE28DDBA8}">
+  <ds:schemaRefs>
+    <ds:schemaRef ds:uri="http://schemas.microsoft.com/sharepoint/v3/contenttype/forms"/>
+  </ds:schemaRefs>
+</ds:datastoreItem>
 </file>
 
-<file path=customXml/itemProps1.xml><?xml version="1.0" encoding="utf-8"?>
+<file path=customXml/itemProps3.xml><?xml version="1.0" encoding="utf-8"?>
 <ds:datastoreItem xmlns:ds="http://schemas.openxmlformats.org/officeDocument/2006/customXml" ds:itemID="{A8A48957-2844-48E7-878B-A3E5BC2D3192}">
   <ds:schemaRefs>
     <ds:schemaRef ds:uri="http://schemas.microsoft.com/office/2006/metadata/contentType"/>
@@ -1563,22 +2285,4 @@
     <ds:schemaRef ds:uri="http://schemas.microsoft.com/internal/obd"/>
   </ds:schemaRefs>
 </ds:datastoreItem>
-</file>
-
-<file path=customXml/itemProps2.xml><?xml version="1.0" encoding="utf-8"?>
-<ds:datastoreItem xmlns:ds="http://schemas.openxmlformats.org/officeDocument/2006/customXml" ds:itemID="{CA523F33-C24B-4143-8B7F-915CE28DDBA8}">
-  <ds:schemaRefs>
-    <ds:schemaRef ds:uri="http://schemas.microsoft.com/sharepoint/v3/contenttype/forms"/>
-  </ds:schemaRefs>
-</ds:datastoreItem>
-</file>
-
-<file path=customXml/itemProps3.xml><?xml version="1.0" encoding="utf-8"?>
-<ds:datastoreItem xmlns:ds="http://schemas.openxmlformats.org/officeDocument/2006/customXml" ds:itemID="{4E66CF83-F9E2-4336-800B-4E9E479183B3}">
-  <ds:schemaRefs>
-    <ds:schemaRef ds:uri="http://schemas.microsoft.com/office/2006/metadata/properties"/>
-    <ds:schemaRef ds:uri="http://schemas.microsoft.com/office/infopath/2007/PartnerControls"/>
-    <ds:schemaRef ds:uri="9429147d-c046-4c6c-ad5d-4c11c57a8b60"/>
-  </ds:schemaRefs>
-</ds:datastoreItem>
 </file>
</xml_diff>